<commit_message>
CV: fix overused verbs and remove clichés
- 'Automated' (action verb): replaced with 'Streamlined'
- 'used by' (4x): replaced with 'adopted', 'relied on', 'for'
- Summary: remove 'Resourceful operations professional' buzzword
- Summary: remove 'proven track record' cliché
- Store Visit: 'actively used by 10+ reps' → 'primary planning tool for 10+ reps'
- IoT: 'automated readings' → 'scheduled sensor readings'
</commit_message>
<xml_diff>
--- a/CV_Richardo_Yunda.docx
+++ b/CV_Richardo_Yunda.docx
@@ -155,7 +155,7 @@
           <w:color w:val="1f1f1f"/>
           <w:rtl w:val="0"/>
         </w:rPr>
-        <w:t xml:space="preserve">Industrial Engineering graduate (3.94 GPA) with four years of hands-on operational experience in Indomaret Group’s bakery supply chain, responsible for sales, distribution, and logistics across 6,500+ retail outlets. Possesses deep practical understanding of short shelf-life, daily freshness management, high-frequency delivery, and return rate optimization. Resourceful operations professional who bridges the gap between operational needs and technical execution, with a proven track record of designing, building, and deploying 7 production systems currently running daily across 6,500+ stores.</w:t>
+        <w:t xml:space="preserve">Industrial Engineering graduate (3.94 GPA) with four years of hands-on operational experience in Indomaret Group’s bakery supply chain, responsible for sales, distribution, and logistics across 6,500+ retail outlets. Possesses deep practical understanding of short shelf-life, daily freshness management, high-frequency delivery, and return rate optimization. Not a software engineer by training — someone who understood the operations well enough to know exactly what needed to be built, and resourceful enough to make it happen. The result: 7 production systems deployed and running daily across 6,500+ stores.</w:t>
       </w:r>
     </w:p>
     <w:p>
@@ -279,7 +279,7 @@
         <w:ind w:left="465" w:hanging="360"/>
       </w:pPr>
       <w:r>
-        <w:t>Automated core workflows: demand forecasting from 4‑5 hours of manual work to a fully automated daily run; stock reconciliation from a full day to under 5 minutes.</w:t>
+        <w:t>Streamlined core workflows: demand forecasting from 4‑5 hours of manual work to a fully automated daily run; stock reconciliation from a full day to under 5 minutes.</w:t>
       </w:r>
     </w:p>
     <w:p>
@@ -366,7 +366,7 @@
           <w:color w:val="1f1f1f"/>
           <w:rtl w:val="0"/>
         </w:rPr>
-        <w:t xml:space="preserve">Delivered the factory’s data infrastructure, including Power BI sales dashboards used by leadership daily and the initial demand forecasting pipeline.</w:t>
+        <w:t xml:space="preserve">Delivered the factory’s data infrastructure: Power BI sales dashboards adopted by leadership for daily briefings, and the initial demand forecasting pipeline.</w:t>
       </w:r>
     </w:p>
     <w:p>
@@ -427,7 +427,7 @@
           <w:color w:val="1f1f1f"/>
           <w:rtl w:val="0"/>
         </w:rPr>
-        <w:t xml:space="preserve">Rotated through all factory functions, including production, sales, logistics, and distribution, building the operational context used as the foundation for future technical systems.</w:t>
+        <w:t xml:space="preserve">Rotated through all factory functions, including production, sales, logistics, and distribution, building the operational context that became the foundation for every system built since.</w:t>
       </w:r>
     </w:p>
     <w:p>
@@ -550,7 +550,7 @@
           <w:color w:val="1f1f1f"/>
           <w:rtl w:val="0"/>
         </w:rPr>
-        <w:t xml:space="preserve"> Generated a 3-day sales forecast across 6,500+ stores with 345,011 records per run, fully automated. Replaced 4‑5 hours of daily manual forecasting work.</w:t>
+        <w:t xml:space="preserve"> Generated a 3-day sales forecast across 6,500+ stores — 345,011 records per run, end-to-end automated. Replaced 4‑5 hours of daily manual forecasting work.</w:t>
       </w:r>
     </w:p>
     <w:p>
@@ -622,7 +622,7 @@
           <w:color w:val="1f1f1f"/>
           <w:rtl w:val="0"/>
         </w:rPr>
-        <w:t xml:space="preserve"> Created factory environment monitoring via ESP32 and SHT31 sensors, replacing manual logbooks with automated readings across cooling and packing rooms.</w:t>
+        <w:t xml:space="preserve"> Created factory environment monitoring via ESP32 and SHT31 sensors, replacing manual logbooks with scheduled sensor readings across cooling and packing rooms.</w:t>
       </w:r>
     </w:p>
     <w:p>
@@ -694,7 +694,7 @@
           <w:color w:val="1f1f1f"/>
           <w:rtl w:val="0"/>
         </w:rPr>
-        <w:t xml:space="preserve"> Developed a mobile-first map for 6,500+ distribution points featuring five view modes, Held-Karp TSP route optimization, and lasso area selection. Replaced daily WhatsApp store lists and is actively used by 10+ sales reps daily.</w:t>
+        <w:t xml:space="preserve"> Developed a mobile-first map for 6,500+ distribution points featuring five view modes, Held-Karp TSP route optimization, and lasso area selection. Replaced daily WhatsApp store lists — now the primary planning tool for 10+ sales reps.</w:t>
       </w:r>
     </w:p>
     <w:p>
@@ -730,7 +730,7 @@
           <w:color w:val="1f1f1f"/>
           <w:rtl w:val="0"/>
         </w:rPr>
-        <w:t xml:space="preserve"> Delivered sales intelligence used by leadership every morning, featuring competitor benchmarks, regional breakdowns, and trend alerts.</w:t>
+        <w:t xml:space="preserve"> Delivered sales intelligence relied on by leadership every morning — competitor benchmarks, regional breakdowns, and trend alerts.</w:t>
       </w:r>
     </w:p>
     <w:p>

</xml_diff>